<commit_message>
feat: add documentation for organizational structure and concept notes
</commit_message>
<xml_diff>
--- a/docs/Kindredly_Foundation_Concept_and_First_Steps.docx
+++ b/docs/Kindredly_Foundation_Concept_and_First_Steps.docx
@@ -179,7 +179,7 @@
         <w:rPr>
           <w:rFonts w:ascii="Aptos" w:hAnsi="Aptos"/>
         </w:rPr>
-        <w:t>a private, family-centered digital home and a calmer starting point for the web. The broader foundation can hold the ideas that do not naturally fit inside Kindredly: information provenance, credibility and forecasting accountability, critical-thinking education, ethical/impact indexing, public situational awareness, open alternatives to extractive software ecosystems, and resilient local-first AI/computing.</w:t>
+        <w:t>a private, family-centered digital home and a calmer starting point for the web. The broader foundation can hold the ideas that do not naturally fit inside Kindredly: information provenance, credibility and forecasting accountability, critical-thinking education, ethical/impact indexing, public situational awareness, and open alternatives to extractive software ecosystems.</w:t>
       </w:r>
     </w:p>
     <w:tbl>
@@ -232,7 +232,7 @@
                 <w:color w:val="1A1A1A"/>
                 <w:sz w:val="20"/>
               </w:rPr>
-              <w:t>Do not launch these as seven unrelated projects. Treat them as a portfolio built on a shared public-interest substrate: open data, provenance, transparent scoring, privacy-preserving preferences, local-first software, interoperability, and community governance.</w:t>
+              <w:t>Do not launch these as seven unrelated projects. Treat them as a portfolio built on a shared public-interest substrate: open data, provenance, transparent scoring, privacy-preserving preferences, interoperability, and community governance.</w:t>
             </w:r>
           </w:p>
         </w:tc>
@@ -337,20 +337,6 @@
           <w:color w:val="1A1A1A"/>
         </w:rPr>
         <w:t>Surface what matters — provide a personalized, scale-aware picture of urgent local and global events.</w:t>
-      </w:r>
-    </w:p>
-    <w:p>
-      <w:pPr>
-        <w:pStyle w:val="ListBullet"/>
-        <w:spacing w:after="40"/>
-        <w:ind w:left="259"/>
-      </w:pPr>
-      <w:r>
-        <w:rPr>
-          <w:rFonts w:ascii="Aptos" w:hAnsi="Aptos"/>
-          <w:color w:val="1A1A1A"/>
-        </w:rPr>
-        <w:t>Preserve resilience — keep useful knowledge and capable AI available locally when cloud access is unwanted or unavailable.</w:t>
       </w:r>
     </w:p>
     <w:p>
@@ -1069,80 +1055,6 @@
           </w:p>
         </w:tc>
       </w:tr>
-      <w:tr>
-        <w:trPr>
-          <w:cantSplit/>
-        </w:trPr>
-        <w:tc>
-          <w:tcPr>
-            <w:tcW w:type="dxa" w:w="3293"/>
-            <w:tcMar>
-              <w:top w:w="90" w:type="dxa"/>
-              <w:start w:w="90" w:type="dxa"/>
-              <w:bottom w:w="90" w:type="dxa"/>
-              <w:end w:w="90" w:type="dxa"/>
-            </w:tcMar>
-            <w:vAlign w:val="top"/>
-          </w:tcPr>
-          <w:p>
-            <w:r>
-              <w:rPr>
-                <w:rFonts w:ascii="Aptos" w:hAnsi="Aptos"/>
-                <w:b/>
-                <w:color w:val="1A1A1A"/>
-                <w:sz w:val="18"/>
-              </w:rPr>
-              <w:t>7. Retain control</w:t>
-            </w:r>
-          </w:p>
-        </w:tc>
-        <w:tc>
-          <w:tcPr>
-            <w:tcW w:type="dxa" w:w="3293"/>
-            <w:tcMar>
-              <w:top w:w="90" w:type="dxa"/>
-              <w:start w:w="90" w:type="dxa"/>
-              <w:bottom w:w="90" w:type="dxa"/>
-              <w:end w:w="90" w:type="dxa"/>
-            </w:tcMar>
-            <w:vAlign w:val="top"/>
-          </w:tcPr>
-          <w:p>
-            <w:r>
-              <w:rPr>
-                <w:rFonts w:ascii="Aptos" w:hAnsi="Aptos"/>
-                <w:b w:val="0"/>
-                <w:color w:val="1A1A1A"/>
-                <w:sz w:val="18"/>
-              </w:rPr>
-              <w:t>Can I still function without the platform/cloud?</w:t>
-            </w:r>
-          </w:p>
-        </w:tc>
-        <w:tc>
-          <w:tcPr>
-            <w:tcW w:type="dxa" w:w="3293"/>
-            <w:tcMar>
-              <w:top w:w="90" w:type="dxa"/>
-              <w:start w:w="90" w:type="dxa"/>
-              <w:bottom w:w="90" w:type="dxa"/>
-              <w:end w:w="90" w:type="dxa"/>
-            </w:tcMar>
-            <w:vAlign w:val="top"/>
-          </w:tcPr>
-          <w:p>
-            <w:r>
-              <w:rPr>
-                <w:rFonts w:ascii="Aptos" w:hAnsi="Aptos"/>
-                <w:b w:val="0"/>
-                <w:color w:val="1A1A1A"/>
-                <w:sz w:val="18"/>
-              </w:rPr>
-              <w:t>Local-first data, offline knowledge, capable local AI, resilient services.</w:t>
-            </w:r>
-          </w:p>
-        </w:tc>
-      </w:tr>
     </w:tbl>
     <w:p/>
     <w:p>
@@ -1284,25 +1196,6 @@
           <w:rFonts w:ascii="Aptos" w:hAnsi="Aptos"/>
         </w:rPr>
         <w:t>People can weight legitimate ethical concerns differently while the foundation maintains clear baseline commitments to human dignity, equality, and non-discrimination.</w:t>
-      </w:r>
-    </w:p>
-    <w:p>
-      <w:pPr>
-        <w:spacing w:after="100"/>
-      </w:pPr>
-      <w:r>
-        <w:rPr>
-          <w:rFonts w:ascii="Aptos" w:hAnsi="Aptos"/>
-          <w:b/>
-          <w:color w:val="17324D"/>
-        </w:rPr>
-        <w:t xml:space="preserve">Local-first resilience. </w:t>
-      </w:r>
-      <w:r>
-        <w:rPr>
-          <w:rFonts w:ascii="Aptos" w:hAnsi="Aptos"/>
-        </w:rPr>
-        <w:t>Important knowledge and useful computation should remain available when a user is offline, disconnected, censored, or simply choosing less cloud dependence.</w:t>
       </w:r>
     </w:p>
     <w:p>
@@ -2165,107 +2058,6 @@
           </w:p>
         </w:tc>
       </w:tr>
-      <w:tr>
-        <w:trPr>
-          <w:cantSplit/>
-        </w:trPr>
-        <w:tc>
-          <w:tcPr>
-            <w:tcW w:type="dxa" w:w="2469"/>
-            <w:tcMar>
-              <w:top w:w="75" w:type="dxa"/>
-              <w:start w:w="80" w:type="dxa"/>
-              <w:bottom w:w="75" w:type="dxa"/>
-              <w:end w:w="80" w:type="dxa"/>
-            </w:tcMar>
-            <w:shd w:fill="F7FAFA"/>
-            <w:vAlign w:val="top"/>
-          </w:tcPr>
-          <w:p>
-            <w:r>
-              <w:rPr>
-                <w:rFonts w:ascii="Aptos" w:hAnsi="Aptos"/>
-                <w:b/>
-                <w:color w:val="1A1A1A"/>
-                <w:sz w:val="17"/>
-              </w:rPr>
-              <w:t>Resilient Personal Computing</w:t>
-            </w:r>
-          </w:p>
-        </w:tc>
-        <w:tc>
-          <w:tcPr>
-            <w:tcW w:type="dxa" w:w="2469"/>
-            <w:tcMar>
-              <w:top w:w="75" w:type="dxa"/>
-              <w:start w:w="80" w:type="dxa"/>
-              <w:bottom w:w="75" w:type="dxa"/>
-              <w:end w:w="80" w:type="dxa"/>
-            </w:tcMar>
-            <w:shd w:fill="F7FAFA"/>
-            <w:vAlign w:val="top"/>
-          </w:tcPr>
-          <w:p>
-            <w:r>
-              <w:rPr>
-                <w:rFonts w:ascii="Aptos" w:hAnsi="Aptos"/>
-                <w:b w:val="0"/>
-                <w:color w:val="1A1A1A"/>
-                <w:sz w:val="17"/>
-              </w:rPr>
-              <w:t>Local knowledge, local AI, distributed/fallback services, and offline-capable tools</w:t>
-            </w:r>
-          </w:p>
-        </w:tc>
-        <w:tc>
-          <w:tcPr>
-            <w:tcW w:type="dxa" w:w="2469"/>
-            <w:tcMar>
-              <w:top w:w="75" w:type="dxa"/>
-              <w:start w:w="80" w:type="dxa"/>
-              <w:bottom w:w="75" w:type="dxa"/>
-              <w:end w:w="80" w:type="dxa"/>
-            </w:tcMar>
-            <w:shd w:fill="F7FAFA"/>
-            <w:vAlign w:val="top"/>
-          </w:tcPr>
-          <w:p>
-            <w:r>
-              <w:rPr>
-                <w:rFonts w:ascii="Aptos" w:hAnsi="Aptos"/>
-                <w:b w:val="0"/>
-                <w:color w:val="1A1A1A"/>
-                <w:sz w:val="17"/>
-              </w:rPr>
-              <w:t>Resilience layer</w:t>
-            </w:r>
-          </w:p>
-        </w:tc>
-        <w:tc>
-          <w:tcPr>
-            <w:tcW w:type="dxa" w:w="2469"/>
-            <w:tcMar>
-              <w:top w:w="75" w:type="dxa"/>
-              <w:start w:w="80" w:type="dxa"/>
-              <w:bottom w:w="75" w:type="dxa"/>
-              <w:end w:w="80" w:type="dxa"/>
-            </w:tcMar>
-            <w:shd w:fill="F7FAFA"/>
-            <w:vAlign w:val="top"/>
-          </w:tcPr>
-          <w:p>
-            <w:r>
-              <w:rPr>
-                <w:rFonts w:ascii="Aptos" w:hAnsi="Aptos"/>
-                <w:b w:val="0"/>
-                <w:color w:val="1A1A1A"/>
-                <w:sz w:val="17"/>
-              </w:rPr>
-              <w:t>Make this a cross-cutting architecture principle before it becomes a standalone product.</w:t>
-            </w:r>
-          </w:p>
-        </w:tc>
-      </w:tr>
     </w:tbl>
     <w:p/>
     <w:p>
@@ -2844,29 +2636,13 @@
           <w:b/>
           <w:color w:val="2F7D7A"/>
         </w:rPr>
-        <w:t xml:space="preserve">Local-first personalization. </w:t>
+        <w:t xml:space="preserve">On-device personalization. </w:t>
       </w:r>
       <w:r>
         <w:rPr>
           <w:rFonts w:ascii="Aptos" w:hAnsi="Aptos"/>
         </w:rPr>
         <w:t>Your privacy principle and the personalized “what matters” dashboard fit together if ranking and preference storage happen on the user’s device.</w:t>
-      </w:r>
-    </w:p>
-    <w:p>
-      <w:r>
-        <w:rPr>
-          <w:rFonts w:ascii="Aptos" w:hAnsi="Aptos"/>
-          <w:b/>
-          <w:color w:val="2F7D7A"/>
-        </w:rPr>
-        <w:t xml:space="preserve">Resilience as a first-class goal. </w:t>
-      </w:r>
-      <w:r>
-        <w:rPr>
-          <w:rFonts w:ascii="Aptos" w:hAnsi="Aptos"/>
-        </w:rPr>
-        <w:t>Offline/local knowledge and AI are not only disaster features; they also reduce dependency and make privacy promises more credible.</w:t>
       </w:r>
     </w:p>
     <w:p>
@@ -3737,7 +3513,7 @@
                 <w:color w:val="1A1A1A"/>
                 <w:sz w:val="18"/>
               </w:rPr>
-              <w:t>What Matters Now dashboard with local-first personalization</w:t>
+              <w:t>What Matters Now dashboard with on-device personalization</w:t>
             </w:r>
           </w:p>
         </w:tc>
@@ -3762,80 +3538,6 @@
                 <w:sz w:val="18"/>
               </w:rPr>
               <w:t>Uses mature data sources and preference logic to guide attention.</w:t>
-            </w:r>
-          </w:p>
-        </w:tc>
-      </w:tr>
-      <w:tr>
-        <w:trPr>
-          <w:cantSplit/>
-        </w:trPr>
-        <w:tc>
-          <w:tcPr>
-            <w:tcW w:type="dxa" w:w="3293"/>
-            <w:tcMar>
-              <w:top w:w="90" w:type="dxa"/>
-              <w:start w:w="90" w:type="dxa"/>
-              <w:bottom w:w="90" w:type="dxa"/>
-              <w:end w:w="90" w:type="dxa"/>
-            </w:tcMar>
-            <w:vAlign w:val="top"/>
-          </w:tcPr>
-          <w:p>
-            <w:r>
-              <w:rPr>
-                <w:rFonts w:ascii="Aptos" w:hAnsi="Aptos"/>
-                <w:b/>
-                <w:color w:val="1A1A1A"/>
-                <w:sz w:val="18"/>
-              </w:rPr>
-              <w:t>Stage 7: Resilience</w:t>
-            </w:r>
-          </w:p>
-        </w:tc>
-        <w:tc>
-          <w:tcPr>
-            <w:tcW w:type="dxa" w:w="3293"/>
-            <w:tcMar>
-              <w:top w:w="90" w:type="dxa"/>
-              <w:start w:w="90" w:type="dxa"/>
-              <w:bottom w:w="90" w:type="dxa"/>
-              <w:end w:w="90" w:type="dxa"/>
-            </w:tcMar>
-            <w:vAlign w:val="top"/>
-          </w:tcPr>
-          <w:p>
-            <w:r>
-              <w:rPr>
-                <w:rFonts w:ascii="Aptos" w:hAnsi="Aptos"/>
-                <w:b w:val="0"/>
-                <w:color w:val="1A1A1A"/>
-                <w:sz w:val="18"/>
-              </w:rPr>
-              <w:t>Offline knowledge packs, local AI, distributed/fallback services</w:t>
-            </w:r>
-          </w:p>
-        </w:tc>
-        <w:tc>
-          <w:tcPr>
-            <w:tcW w:type="dxa" w:w="3293"/>
-            <w:tcMar>
-              <w:top w:w="90" w:type="dxa"/>
-              <w:start w:w="90" w:type="dxa"/>
-              <w:bottom w:w="90" w:type="dxa"/>
-              <w:end w:w="90" w:type="dxa"/>
-            </w:tcMar>
-            <w:vAlign w:val="top"/>
-          </w:tcPr>
-          <w:p>
-            <w:r>
-              <w:rPr>
-                <w:rFonts w:ascii="Aptos" w:hAnsi="Aptos"/>
-                <w:b w:val="0"/>
-                <w:color w:val="1A1A1A"/>
-                <w:sz w:val="18"/>
-              </w:rPr>
-              <w:t>Deepens independence and continuity across the entire portfolio.</w:t>
             </w:r>
           </w:p>
         </w:tc>

</xml_diff>